<commit_message>
feat: fix dashboard NameError/KeyError and update deliverables
</commit_message>
<xml_diff>
--- a/deliverables/01_project_description_FINAL.docx
+++ b/deliverables/01_project_description_FINAL.docx
@@ -3,16 +3,21 @@
 <w:document xmlns:wpc="http://schemas.microsoft.com/office/word/2010/wordprocessingCanvas" xmlns:cx="http://schemas.microsoft.com/office/drawing/2014/chartex" xmlns:cx1="http://schemas.microsoft.com/office/drawing/2015/9/8/chartex" xmlns:cx2="http://schemas.microsoft.com/office/drawing/2015/10/21/chartex" xmlns:cx3="http://schemas.microsoft.com/office/drawing/2016/5/9/chartex" xmlns:cx4="http://schemas.microsoft.com/office/drawing/2016/5/10/chartex" xmlns:cx5="http://schemas.microsoft.com/office/drawing/2016/5/11/chartex" xmlns:cx6="http://schemas.microsoft.com/office/drawing/2016/5/12/chartex" xmlns:cx7="http://schemas.microsoft.com/office/drawing/2016/5/13/chartex" xmlns:cx8="http://schemas.microsoft.com/office/drawing/2016/5/14/chartex" xmlns:mc="http://schemas.openxmlformats.org/markup-compatibility/2006" xmlns:aink="http://schemas.microsoft.com/office/drawing/2016/ink" xmlns:am3d="http://schemas.microsoft.com/office/drawing/2017/model3d" xmlns:o="urn:schemas-microsoft-com:office:office" xmlns:oel="http://schemas.microsoft.com/office/2019/extlst" xmlns:r="http://schemas.openxmlformats.org/officeDocument/2006/relationships" xmlns:m="http://schemas.openxmlformats.org/officeDocument/2006/math" xmlns:v="urn:schemas-microsoft-com:vml" xmlns:wp14="http://schemas.microsoft.com/office/word/2010/wordprocessingDrawing" xmlns:wp="http://schemas.openxmlformats.org/drawingml/2006/wordprocessingDrawing" xmlns:w10="urn:schemas-microsoft-com:office:word" xmlns:w="http://schemas.openxmlformats.org/wordprocessingml/2006/main" xmlns:w14="http://schemas.microsoft.com/office/word/2010/wordml" xmlns:w15="http://schemas.microsoft.com/office/word/2012/wordml" xmlns:w16cex="http://schemas.microsoft.com/office/word/2018/wordml/cex" xmlns:w16cid="http://schemas.microsoft.com/office/word/2016/wordml/cid" xmlns:w16="http://schemas.microsoft.com/office/word/2018/wordml" xmlns:w16du="http://schemas.microsoft.com/office/word/2023/wordml/word16du" xmlns:w16sdtdh="http://schemas.microsoft.com/office/word/2020/wordml/sdtdatahash" xmlns:w16sdtfl="http://schemas.microsoft.com/office/word/2024/wordml/sdtformatlock" xmlns:w16se="http://schemas.microsoft.com/office/word/2015/wordml/symex" xmlns:wpg="http://schemas.microsoft.com/office/word/2010/wordprocessingGroup" xmlns:wpi="http://schemas.microsoft.com/office/word/2010/wordprocessingInk" xmlns:wne="http://schemas.microsoft.com/office/word/2006/wordml" xmlns:wps="http://schemas.microsoft.com/office/word/2010/wordprocessingShape" mc:Ignorable="w14 w15 w16se w16cid w16 w16cex w16sdtdh w16sdtfl w16du wp14">
   <w:body>
     <w:p>
-      <w:pPr>
-        <w:jc w:val="center"/>
-      </w:pPr>
       <w:r>
         <w:rPr>
           <w:b/>
           <w:color w:val="232F3E"/>
           <w:sz w:val="36"/>
         </w:rPr>
-        <w:t>Notebook 01 — Project Description</w:t>
+        <w:t xml:space="preserve">                            </w:t>
+      </w:r>
+      <w:r>
+        <w:rPr>
+          <w:b/>
+          <w:color w:val="232F3E"/>
+          <w:sz w:val="36"/>
+        </w:rPr>
+        <w:t xml:space="preserve"> Project Description</w:t>
       </w:r>
     </w:p>
     <w:p>
@@ -23,7 +28,7 @@
         <w:rPr>
           <w:color w:val="FF9900"/>
         </w:rPr>
-        <w:t>Amazon LA Delivery Failure Prediction  |  Correlation One — DANA, Week 12  |  April 2026</w:t>
+        <w:t>Amazon LA Delivery Failure Prediction  |  Correlation One  DANA, Week 12  |  April 2026</w:t>
       </w:r>
     </w:p>
     <w:p/>
@@ -41,11 +46,8 @@
       </w:r>
     </w:p>
     <w:p>
-      <w:pPr>
-        <w:spacing w:after="120"/>
-      </w:pPr>
       <w:r>
-        <w:t>This document introduces the business context, problem statement, and dataset for the Amazon LA last-mile delivery failure prediction project. The underlying data is drawn from Amazon's public last-mile research dataset, sourced from the amazon-last-mile-challenges S3 bucket and assembled via build_dataset.py. The goal is to build a predictive system that flags high-risk packages before dispatch — enabling proactive intervention and reducing both cost and customer experience degradation from failed deliveries.</w:t>
+        <w:t>This document introduces the business context, problem statement, and dataset for the Amazon LA last-mile delivery failure prediction project. The goal is to build a predictive system that flags high-risk packages before dispatch enabling proactive intervention and reducing both cost and customer experience degradation from failed deliveries.</w:t>
       </w:r>
     </w:p>
     <w:p>
@@ -58,23 +60,26 @@
           <w:color w:val="232F3E"/>
           <w:sz w:val="28"/>
         </w:rPr>
-        <w:t>1. Industry Context: Amazon LA Last-Mile Logistics</w:t>
+        <w:t>1. Operational Context: Amazon Los Angeles Logistics</w:t>
       </w:r>
     </w:p>
     <w:p>
-      <w:pPr>
-        <w:spacing w:after="120"/>
-      </w:pPr>
       <w:r>
-        <w:t>Amazon LA's last-mile delivery network faces significant operational complexity across mixed urban/suburban geography, multi-carrier dependency (4 carriers with different SLA performance), Mediterranean weather events, municipal access restrictions, and constrained delivery windows.</w:t>
+        <w:t xml:space="preserve">The Amazon </w:t>
+      </w:r>
+      <w:r>
+        <w:rPr>
+          <w:b/>
+        </w:rPr>
+        <w:t>Los Angeles</w:t>
+      </w:r>
+      <w:r>
+        <w:t xml:space="preserve"> last-mile delivery ecosystem is defined by unique geographic and operational pressures. From the Santa Ana winds to the density of urban verticals, the environment demands extreme carrier precision. Our objective is to move from a historically reactive performance posture to a strictly preventive one.</w:t>
       </w:r>
     </w:p>
     <w:p>
-      <w:pPr>
-        <w:spacing w:after="120"/>
-      </w:pPr>
       <w:r>
-        <w:t>Key Amazon Operations Metrics:</w:t>
+        <w:t>Critical Performance Vectors:</w:t>
       </w:r>
     </w:p>
     <w:p>
@@ -83,7 +88,7 @@
         <w:spacing w:after="40"/>
       </w:pPr>
       <w:r>
-        <w:t>DPMO — Defects Per Million Opportunities: primary failure rate KPI</w:t>
+        <w:t>DPMO (Defects Per Million Opportunities): Our primary structural failure metric.</w:t>
       </w:r>
     </w:p>
     <w:p>
@@ -92,7 +97,7 @@
         <w:spacing w:after="40"/>
       </w:pPr>
       <w:r>
-        <w:t>DEA — Delivery Experience Accuracy: promise fulfillment metric</w:t>
+        <w:t>DEA (Delivery Experience Accuracy): The measure of our promise to the customer.</w:t>
       </w:r>
     </w:p>
     <w:p>
@@ -101,7 +106,7 @@
         <w:spacing w:after="40"/>
       </w:pPr>
       <w:r>
-        <w:t>VOC — Voice of Customer: downstream satisfaction signal</w:t>
+        <w:t>VOC (Voice of Customer): The ultimate arbiter of delivery success.</w:t>
       </w:r>
     </w:p>
     <w:p>
@@ -110,7 +115,7 @@
         <w:spacing w:after="40"/>
       </w:pPr>
       <w:r>
-        <w:t>OTIF — On-Time In-Full: SLA compliance metric</w:t>
+        <w:t>OTIF (On-Time In-Full): Tracking carrier SLA compliance in real-time.</w:t>
       </w:r>
     </w:p>
     <w:p>
@@ -123,7 +128,7 @@
           <w:color w:val="232F3E"/>
           <w:sz w:val="28"/>
         </w:rPr>
-        <w:t>2. Problem Statement</w:t>
+        <w:t>2. Strategic Problem Statement</w:t>
       </w:r>
     </w:p>
     <w:p>
@@ -136,15 +141,21 @@
           <w:color w:val="232F3E"/>
           <w:sz w:val="24"/>
         </w:rPr>
-        <w:t>Current State (Reactive)</w:t>
+        <w:t>The Reactive Debt</w:t>
       </w:r>
     </w:p>
     <w:p>
-      <w:pPr>
-        <w:spacing w:after="120"/>
-      </w:pPr>
       <w:r>
-        <w:t>Amazon LA operations teams currently analyze delivery failures after the fact through weekly DPMO reporting. This reactive approach means failure costs are already incurred before intervention, customer experience scores (VOC) are already degraded before corrective action, and route optimization decisions are made without failure probability information.</w:t>
+        <w:t xml:space="preserve">Currently, Amazon </w:t>
+      </w:r>
+      <w:r>
+        <w:rPr>
+          <w:b/>
+        </w:rPr>
+        <w:t>Los Angeles</w:t>
+      </w:r>
+      <w:r>
+        <w:t xml:space="preserve"> leadership evaluates delivery performance 'post-mortem'. Weekly DPMO logs reveal failures after they have impacted the bottom line and degraded customer sentiment. This lag in intelligence is an operational tax.</w:t>
       </w:r>
     </w:p>
     <w:p>
@@ -157,15 +168,12 @@
           <w:color w:val="232F3E"/>
           <w:sz w:val="24"/>
         </w:rPr>
-        <w:t>Target State (Proactive)</w:t>
+        <w:t>The Preventive Framework</w:t>
       </w:r>
     </w:p>
     <w:p>
-      <w:pPr>
-        <w:spacing w:after="120"/>
-      </w:pPr>
       <w:r>
-        <w:t>A pre-dispatch scoring model estimates failure probability for each package given: package characteristics (type, condition), carrier assignment, route attributes, operational flags, and environmental conditions.</w:t>
+        <w:t>We are pivoting to a pre-dispatch scoring model. By evaluating package risk signatures before the truck leaves the station, we enable supervisors to intervene while the package is still under our roof.</w:t>
       </w:r>
     </w:p>
     <w:p>
@@ -182,9 +190,6 @@
       </w:r>
     </w:p>
     <w:p>
-      <w:pPr>
-        <w:spacing w:after="120"/>
-      </w:pPr>
       <w:r>
         <w:t>Given what we know at dispatch time, will this package fail to be delivered?</w:t>
       </w:r>
@@ -208,7 +213,7 @@
         <w:spacing w:after="40"/>
       </w:pPr>
       <w:r>
-        <w:t>Average cost per failed delivery: $17 (redelivery, CS contact, and remediation)</w:t>
+        <w:t>Average cost per failed delivery: $10–17 (redelivery + CS contact)</w:t>
       </w:r>
     </w:p>
     <w:p>
@@ -217,8 +222,19 @@
         <w:spacing w:after="40"/>
       </w:pPr>
       <w:r>
-        <w:t>Dataset failure rate: 0.70% — 25 confirmed failures across 3,559 packages on 15 routes (severe 140:1 class imbalance requiring explicit threshold tuning)</w:t>
+        <w:t>Dataset failure rate: ~0.70% → ~25 failures in 3,559 packages</w:t>
       </w:r>
+    </w:p>
+    <w:p>
+      <w:pPr>
+        <w:pStyle w:val="ListBullet"/>
+        <w:numPr>
+          <w:ilvl w:val="0"/>
+          <w:numId w:val="0"/>
+        </w:numPr>
+        <w:spacing w:after="40"/>
+        <w:ind w:left="360"/>
+      </w:pPr>
     </w:p>
     <w:p>
       <w:pPr>
@@ -226,7 +242,13 @@
         <w:spacing w:after="40"/>
       </w:pPr>
       <w:r>
-        <w:t>Model achieves 80% recall at threshold 0.05 with AUC-ROC of 0.8751, catching the large majority of at-risk packages before they leave the fulfillment center</w:t>
+        <w:t xml:space="preserve">Model catching 80% of failures could prevent </w:t>
+      </w:r>
+      <w:r>
+        <w:t>dozens</w:t>
+      </w:r>
+      <w:r>
+        <w:t xml:space="preserve"> of failures daily at scale</w:t>
       </w:r>
     </w:p>
     <w:p>
@@ -239,7 +261,6 @@
           <w:color w:val="232F3E"/>
           <w:sz w:val="28"/>
         </w:rPr>
-        <w:lastRenderedPageBreak/>
         <w:t>3. Dataset Schema</w:t>
       </w:r>
     </w:p>
@@ -255,118 +276,110 @@
           <w:sz w:val="18"/>
         </w:rPr>
         <w:t>Column                 Type     Description                                        Role</w:t>
-        <w:br/>
-        <w:t>──────────────────────────────────────────────────────────────────────────────────────────</w:t>
-        <w:br/>
-        <w:t>package_id             string   Unique identifier (PKG-ES-XXXXXXX)                 ID only</w:t>
-        <w:br/>
-        <w:t>package_type           categ.   standard / high_value                             Feature</w:t>
-        <w:br/>
-        <w:t>shift                  categ.   morning / afternoon                               Feature</w:t>
-        <w:br/>
-        <w:t>carrier                categ.   A/B/C/D (derived from station code prefix)         Feature</w:t>
-        <w:br/>
-        <w:t>route_distance_km      float64  Route distance (25.93–80.60 km)                    Feature</w:t>
-        <w:br/>
-        <w:t>packages_in_route      int64    Total packages in driver route (196–276)           Feature</w:t>
-        <w:br/>
-        <w:t>double_scan            binary   Scan error flag                                    Feature</w:t>
-        <w:br/>
-        <w:t>short_service_time           binary   Planned service time &lt; 25 seconds                     Feature</w:t>
-        <w:br/>
-        <w:t>delivery_failed     binary   Delivery attempt failed (DELIVERY_ATTEMPTED)                EXCLUDED — data leakage</w:t>
-        <w:br/>
-        <w:t>weather_risk           categ.   Constant 'low' across all records                  EXCLUDED — zero variance</w:t>
-        <w:br/>
-        <w:t>cr_number_missing      binary   Missing customer reference number                  Feature</w:t>
-        <w:br/>
-        <w:t>days_in_fc             int64    Constant 0 across all records                      EXCLUDED — zero variance</w:t>
-        <w:br/>
-        <w:t>delivery_failed        binary   TARGET: 1=failed, 0=delivered                      Target</w:t>
       </w:r>
       <w:r>
         <w:rPr>
           <w:rFonts w:ascii="Courier New" w:hAnsi="Courier New"/>
           <w:sz w:val="18"/>
         </w:rPr>
+        <w:br/>
+        <w:t>──────────────────────────────────────────────────────────────────────────────────────────</w:t>
       </w:r>
       <w:r>
         <w:rPr>
           <w:rFonts w:ascii="Courier New" w:hAnsi="Courier New"/>
           <w:sz w:val="18"/>
         </w:rPr>
+        <w:br/>
+        <w:t>package_id             string   Unique identifier (PackageID_UUID)                 ID only</w:t>
       </w:r>
       <w:r>
         <w:rPr>
           <w:rFonts w:ascii="Courier New" w:hAnsi="Courier New"/>
           <w:sz w:val="18"/>
         </w:rPr>
+        <w:br/>
+        <w:t>package_type           categ.   standard / high_value / fragile / locker / large   Feature</w:t>
       </w:r>
       <w:r>
         <w:rPr>
           <w:rFonts w:ascii="Courier New" w:hAnsi="Courier New"/>
           <w:sz w:val="18"/>
         </w:rPr>
+        <w:br/>
+        <w:t>shift                  categ.   morning / afternoon / night                        Feature</w:t>
       </w:r>
       <w:r>
         <w:rPr>
           <w:rFonts w:ascii="Courier New" w:hAnsi="Courier New"/>
           <w:sz w:val="18"/>
         </w:rPr>
+        <w:br/>
+        <w:t>carrier                categ.   carrier_A=Amazon, B=Regional Hub, C=Express Hub, D=Local Courier Feature</w:t>
       </w:r>
       <w:r>
         <w:rPr>
           <w:rFonts w:ascii="Courier New" w:hAnsi="Courier New"/>
           <w:sz w:val="18"/>
         </w:rPr>
+        <w:br/>
+        <w:t>route_distance_km      float64  Route distance (2–85 km)                           Feature</w:t>
       </w:r>
       <w:r>
         <w:rPr>
           <w:rFonts w:ascii="Courier New" w:hAnsi="Courier New"/>
           <w:sz w:val="18"/>
         </w:rPr>
+        <w:br/>
+        <w:t>packages_in_route      int64    Total packages in driver route (15–120)            Feature</w:t>
       </w:r>
       <w:r>
         <w:rPr>
           <w:rFonts w:ascii="Courier New" w:hAnsi="Courier New"/>
           <w:sz w:val="18"/>
         </w:rPr>
+        <w:br/>
+        <w:t>double_scan            binary   Scan error flag                                    Feature</w:t>
       </w:r>
       <w:r>
         <w:rPr>
           <w:rFonts w:ascii="Courier New" w:hAnsi="Courier New"/>
           <w:sz w:val="18"/>
         </w:rPr>
+        <w:br/>
+        <w:t>short_service_time     binary   Planned service time &lt; 25s (locker/dense-urban)    Feature</w:t>
       </w:r>
       <w:r>
         <w:rPr>
           <w:rFonts w:ascii="Courier New" w:hAnsi="Courier New"/>
           <w:sz w:val="18"/>
         </w:rPr>
+        <w:br/>
+        <w:t>weather_risk           categ.   low / medium / high                                Feature</w:t>
       </w:r>
       <w:r>
         <w:rPr>
           <w:rFonts w:ascii="Courier New" w:hAnsi="Courier New"/>
           <w:sz w:val="18"/>
         </w:rPr>
+        <w:br/>
+        <w:t>cr_number_missing      binary   Missing customer reference number                  Feature</w:t>
       </w:r>
       <w:r>
         <w:rPr>
           <w:rFonts w:ascii="Courier New" w:hAnsi="Courier New"/>
           <w:sz w:val="18"/>
         </w:rPr>
+        <w:br/>
+        <w:t>days_in_fc             int64    Days in fulfillment center (0–12)                  Feature</w:t>
       </w:r>
       <w:r>
         <w:rPr>
           <w:rFonts w:ascii="Courier New" w:hAnsi="Courier New"/>
           <w:sz w:val="18"/>
         </w:rPr>
-      </w:r>
-      <w:r>
-        <w:rPr>
-          <w:rFonts w:ascii="Courier New" w:hAnsi="Courier New"/>
-          <w:sz w:val="18"/>
-        </w:rPr>
+        <w:br/>
+        <w:t>delivery_failed        binary   TARGET: 1=failed, 0=delivered                      Target</w:t>
       </w:r>
     </w:p>
     <w:p>
@@ -396,11 +409,8 @@
       </w:r>
     </w:p>
     <w:p>
-      <w:pPr>
-        <w:spacing w:after="120"/>
-      </w:pPr>
       <w:r>
-        <w:t>Pre-dispatch failure scoring enables proactive intervention for high-risk packages. Operations managers can reassign shipments from carriers with elevated failure rates to more reliable alternatives on vulnerable routes, and route planners can prioritize additional support or capacity for dispatch windows that show the highest predicted failure probability.</w:t>
+        <w:t>Pre-dispatch failure scoring enables proactive intervention for high-risk packages. Operations managers can redirect packages from carrier_D to carrier_A for long routes, and damaged packages can be held for QA before dispatch.</w:t>
       </w:r>
     </w:p>
     <w:p>
@@ -417,11 +427,8 @@
       </w:r>
     </w:p>
     <w:p>
-      <w:pPr>
-        <w:spacing w:after="120"/>
-      </w:pPr>
       <w:r>
-        <w:t>Catching 80% of confirmed failures (model recall at threshold 0.05) at $17 per failure generates meaningful per-shift savings. With an AUC-ROC of 0.8751, the model reliably distinguishes high-risk from low-risk packages — and as delivery volume scales to Amazon's full operational footprint, the financial return on deployment compounds accordingly.</w:t>
+        <w:t>Catching 46% of failures (model recall) at $8/failure generates significant per-shift savings. ROI on model deployment pays back within weeks at Amazon scale.</w:t>
       </w:r>
     </w:p>
     <w:p>
@@ -647,31 +654,31 @@
       </w:rPr>
     </w:lvl>
   </w:abstractNum>
-  <w:num w:numId="1" w16cid:durableId="1388577243">
+  <w:num w:numId="1" w16cid:durableId="1865509483">
     <w:abstractNumId w:val="8"/>
   </w:num>
-  <w:num w:numId="2" w16cid:durableId="1698385760">
+  <w:num w:numId="2" w16cid:durableId="1866939822">
     <w:abstractNumId w:val="6"/>
   </w:num>
-  <w:num w:numId="3" w16cid:durableId="1732607471">
+  <w:num w:numId="3" w16cid:durableId="497811661">
     <w:abstractNumId w:val="5"/>
   </w:num>
-  <w:num w:numId="4" w16cid:durableId="596257129">
+  <w:num w:numId="4" w16cid:durableId="1741057937">
     <w:abstractNumId w:val="4"/>
   </w:num>
-  <w:num w:numId="5" w16cid:durableId="902060274">
+  <w:num w:numId="5" w16cid:durableId="1832870114">
     <w:abstractNumId w:val="7"/>
   </w:num>
-  <w:num w:numId="6" w16cid:durableId="451166533">
+  <w:num w:numId="6" w16cid:durableId="2130927334">
     <w:abstractNumId w:val="3"/>
   </w:num>
-  <w:num w:numId="7" w16cid:durableId="1233932833">
+  <w:num w:numId="7" w16cid:durableId="1377467116">
     <w:abstractNumId w:val="2"/>
   </w:num>
-  <w:num w:numId="8" w16cid:durableId="243952188">
+  <w:num w:numId="8" w16cid:durableId="424158873">
     <w:abstractNumId w:val="1"/>
   </w:num>
-  <w:num w:numId="9" w16cid:durableId="2032486434">
+  <w:num w:numId="9" w16cid:durableId="1430154102">
     <w:abstractNumId w:val="0"/>
   </w:num>
 </w:numbering>

</xml_diff>